<commit_message>
reduce lab report screenshot requirements
</commit_message>
<xml_diff>
--- a/Lab01/report/21127645_LeMinh_21127224_NguyenVuBach_Lab01_XSS.docx
+++ b/Lab01/report/21127645_LeMinh_21127224_NguyenVuBach_Lab01_XSS.docx
@@ -5325,6 +5325,583 @@
       </w:tr>
     </w:tbl>
     <w:p/>
+    <w:p>
+      <w:r>
+        <w:br w:type="page"/>
+      </w:r>
+    </w:p>
+    <w:p>
+      <w:pPr>
+        <w:spacing w:before="160" w:after="80"/>
+      </w:pPr>
+      <w:r>
+        <w:rPr>
+          <w:rFonts w:ascii="Times New Roman" w:hAnsi="Times New Roman"/>
+          <w:b/>
+          <w:color w:val="2F5597"/>
+          <w:sz w:val="30"/>
+        </w:rPr>
+        <w:t>PHỤ LỤC BẰNG CHỨNG HÌNH ẢNH TỐI GIẢN</w:t>
+      </w:r>
+    </w:p>
+    <w:p>
+      <w:pPr>
+        <w:spacing w:before="0" w:after="100"/>
+      </w:pPr>
+      <w:r>
+        <w:rPr>
+          <w:rFonts w:ascii="Times New Roman" w:hAnsi="Times New Roman"/>
+          <w:b w:val="0"/>
+          <w:sz w:val="24"/>
+        </w:rPr>
+        <w:t>Phần này là bộ ảnh minh chứng tối thiểu cho Lab01 - CROSS-SITE SCRIPTING (XSS). Danh sách dưới đây thay cho việc chụp riêng từng tab DevTools hoặc nhiều ảnh lặp cùng một kết quả.</w:t>
+      </w:r>
+    </w:p>
+    <w:p>
+      <w:pPr>
+        <w:spacing w:before="0" w:after="80"/>
+      </w:pPr>
+      <w:r>
+        <w:rPr>
+          <w:rFonts w:ascii="Times New Roman" w:hAnsi="Times New Roman"/>
+          <w:b/>
+          <w:sz w:val="24"/>
+        </w:rPr>
+        <w:t>Tổng số ảnh cần chèn: 5.</w:t>
+      </w:r>
+    </w:p>
+    <w:p>
+      <w:pPr>
+        <w:spacing w:before="0" w:after="120"/>
+      </w:pPr>
+      <w:r>
+        <w:rPr>
+          <w:rFonts w:ascii="Times New Roman" w:hAnsi="Times New Roman"/>
+          <w:b w:val="0"/>
+          <w:sz w:val="24"/>
+        </w:rPr>
+        <w:t>Quy tắc: dùng đúng localhost và scenario có sẵn trong repository, giữ URL/route và kết quả chính, che password, session ID, cookie/token/secret dài. Không cần ảnh cài đặt, terminal khởi động, trang chủ hoặc ảnh trung gian.</w:t>
+      </w:r>
+    </w:p>
+    <w:p>
+      <w:pPr>
+        <w:spacing w:before="120" w:after="60"/>
+      </w:pPr>
+      <w:r>
+        <w:rPr>
+          <w:rFonts w:ascii="Times New Roman" w:hAnsi="Times New Roman"/>
+          <w:b/>
+          <w:sz w:val="24"/>
+        </w:rPr>
+        <w:t>Hình 1. Reflected XSS - bản vulnerable</w:t>
+      </w:r>
+    </w:p>
+    <w:tbl>
+      <w:tblPr>
+        <w:tblW w:type="auto" w:w="0"/>
+        <w:tblLayout w:type="fixed"/>
+        <w:tblLook w:firstColumn="1" w:firstRow="1" w:lastColumn="0" w:lastRow="0" w:noHBand="0" w:noVBand="1" w:val="04A0"/>
+      </w:tblPr>
+      <w:tblGrid>
+        <w:gridCol w:w="9072"/>
+      </w:tblGrid>
+      <w:tr>
+        <w:tc>
+          <w:tcPr>
+            <w:tcW w:type="dxa" w:w="9072"/>
+            <w:vAlign w:val="center"/>
+            <w:tcBorders>
+              <w:top w:val="dashed" w:sz="8" w:color="808080"/>
+              <w:left w:val="dashed" w:sz="8" w:color="808080"/>
+              <w:bottom w:val="dashed" w:sz="8" w:color="808080"/>
+              <w:right w:val="dashed" w:sz="8" w:color="808080"/>
+            </w:tcBorders>
+            <w:shd w:fill="F2F2F2"/>
+          </w:tcPr>
+          <w:p>
+            <w:pPr>
+              <w:spacing w:before="680" w:after="680"/>
+              <w:jc w:val="center"/>
+            </w:pPr>
+            <w:r>
+              <w:rPr>
+                <w:rFonts w:ascii="Times New Roman" w:hAnsi="Times New Roman"/>
+                <w:b/>
+                <w:sz w:val="28"/>
+              </w:rPr>
+              <w:t>[ CHÈN ẢNH 01 TẠI ĐÂY ]</w:t>
+              <w:br/>
+              <w:t>01_reflected_vulnerable.png</w:t>
+            </w:r>
+          </w:p>
+        </w:tc>
+      </w:tr>
+    </w:tbl>
+    <w:p>
+      <w:pPr>
+        <w:spacing w:before="40" w:after="40"/>
+      </w:pPr>
+      <w:r>
+        <w:rPr>
+          <w:rFonts w:ascii="Times New Roman" w:hAnsi="Times New Roman"/>
+          <w:b/>
+          <w:sz w:val="24"/>
+        </w:rPr>
+        <w:t xml:space="preserve">Ảnh phải thể hiện: </w:t>
+      </w:r>
+      <w:r>
+        <w:rPr>
+          <w:rFonts w:ascii="Times New Roman" w:hAnsi="Times New Roman"/>
+          <w:b w:val="0"/>
+          <w:sz w:val="24"/>
+        </w:rPr>
+        <w:t>Hiển thị URL /vulnerable/search, payload đã nhập, alert hoặc DOM img/onerror và Network request q. Một ảnh phải chứng minh input bị phản chiếu thành HTML thực thi.</w:t>
+      </w:r>
+    </w:p>
+    <w:p>
+      <w:pPr>
+        <w:spacing w:after="100"/>
+      </w:pPr>
+      <w:r>
+        <w:rPr>
+          <w:rFonts w:ascii="Times New Roman" w:hAnsi="Times New Roman"/>
+          <w:b/>
+          <w:sz w:val="24"/>
+        </w:rPr>
+        <w:t>Tên file đề nghị: 01_reflected_vulnerable.png</w:t>
+      </w:r>
+    </w:p>
+    <w:p>
+      <w:pPr>
+        <w:spacing w:before="120" w:after="60"/>
+      </w:pPr>
+      <w:r>
+        <w:rPr>
+          <w:rFonts w:ascii="Times New Roman" w:hAnsi="Times New Roman"/>
+          <w:b/>
+          <w:sz w:val="24"/>
+        </w:rPr>
+        <w:t>Hình 2. Reflected XSS - bản secure</w:t>
+      </w:r>
+    </w:p>
+    <w:tbl>
+      <w:tblPr>
+        <w:tblW w:type="auto" w:w="0"/>
+        <w:tblLayout w:type="fixed"/>
+        <w:tblLook w:firstColumn="1" w:firstRow="1" w:lastColumn="0" w:lastRow="0" w:noHBand="0" w:noVBand="1" w:val="04A0"/>
+      </w:tblPr>
+      <w:tblGrid>
+        <w:gridCol w:w="9072"/>
+      </w:tblGrid>
+      <w:tr>
+        <w:tc>
+          <w:tcPr>
+            <w:tcW w:type="dxa" w:w="9072"/>
+            <w:vAlign w:val="center"/>
+            <w:tcBorders>
+              <w:top w:val="dashed" w:sz="8" w:color="808080"/>
+              <w:left w:val="dashed" w:sz="8" w:color="808080"/>
+              <w:bottom w:val="dashed" w:sz="8" w:color="808080"/>
+              <w:right w:val="dashed" w:sz="8" w:color="808080"/>
+            </w:tcBorders>
+            <w:shd w:fill="F2F2F2"/>
+          </w:tcPr>
+          <w:p>
+            <w:pPr>
+              <w:spacing w:before="680" w:after="680"/>
+              <w:jc w:val="center"/>
+            </w:pPr>
+            <w:r>
+              <w:rPr>
+                <w:rFonts w:ascii="Times New Roman" w:hAnsi="Times New Roman"/>
+                <w:b/>
+                <w:sz w:val="28"/>
+              </w:rPr>
+              <w:t>[ CHÈN ẢNH 02 TẠI ĐÂY ]</w:t>
+              <w:br/>
+              <w:t>02_reflected_secure.png</w:t>
+            </w:r>
+          </w:p>
+        </w:tc>
+      </w:tr>
+    </w:tbl>
+    <w:p>
+      <w:pPr>
+        <w:spacing w:before="40" w:after="40"/>
+      </w:pPr>
+      <w:r>
+        <w:rPr>
+          <w:rFonts w:ascii="Times New Roman" w:hAnsi="Times New Roman"/>
+          <w:b/>
+          <w:sz w:val="24"/>
+        </w:rPr>
+        <w:t xml:space="preserve">Ảnh phải thể hiện: </w:t>
+      </w:r>
+      <w:r>
+        <w:rPr>
+          <w:rFonts w:ascii="Times New Roman" w:hAnsi="Times New Roman"/>
+          <w:b w:val="0"/>
+          <w:sz w:val="24"/>
+        </w:rPr>
+        <w:t>Gửi đúng payload ở /secure/search. Ảnh phải thấy payload chỉ hiển thị như text/đã encode và không có alert.</w:t>
+      </w:r>
+    </w:p>
+    <w:p>
+      <w:pPr>
+        <w:spacing w:after="100"/>
+      </w:pPr>
+      <w:r>
+        <w:rPr>
+          <w:rFonts w:ascii="Times New Roman" w:hAnsi="Times New Roman"/>
+          <w:b/>
+          <w:sz w:val="24"/>
+        </w:rPr>
+        <w:t>Tên file đề nghị: 02_reflected_secure.png</w:t>
+      </w:r>
+    </w:p>
+    <w:p>
+      <w:pPr>
+        <w:spacing w:before="120" w:after="60"/>
+      </w:pPr>
+      <w:r>
+        <w:rPr>
+          <w:rFonts w:ascii="Times New Roman" w:hAnsi="Times New Roman"/>
+          <w:b/>
+          <w:sz w:val="24"/>
+        </w:rPr>
+        <w:t>Hình 3. Stored XSS - lưu và tồn tại sau reload</w:t>
+      </w:r>
+    </w:p>
+    <w:tbl>
+      <w:tblPr>
+        <w:tblW w:type="auto" w:w="0"/>
+        <w:tblLayout w:type="fixed"/>
+        <w:tblLook w:firstColumn="1" w:firstRow="1" w:lastColumn="0" w:lastRow="0" w:noHBand="0" w:noVBand="1" w:val="04A0"/>
+      </w:tblPr>
+      <w:tblGrid>
+        <w:gridCol w:w="9072"/>
+      </w:tblGrid>
+      <w:tr>
+        <w:tc>
+          <w:tcPr>
+            <w:tcW w:type="dxa" w:w="9072"/>
+            <w:vAlign w:val="center"/>
+            <w:tcBorders>
+              <w:top w:val="dashed" w:sz="8" w:color="808080"/>
+              <w:left w:val="dashed" w:sz="8" w:color="808080"/>
+              <w:bottom w:val="dashed" w:sz="8" w:color="808080"/>
+              <w:right w:val="dashed" w:sz="8" w:color="808080"/>
+            </w:tcBorders>
+            <w:shd w:fill="F2F2F2"/>
+          </w:tcPr>
+          <w:p>
+            <w:pPr>
+              <w:spacing w:before="680" w:after="680"/>
+              <w:jc w:val="center"/>
+            </w:pPr>
+            <w:r>
+              <w:rPr>
+                <w:rFonts w:ascii="Times New Roman" w:hAnsi="Times New Roman"/>
+                <w:b/>
+                <w:sz w:val="28"/>
+              </w:rPr>
+              <w:t>[ CHÈN ẢNH 03 TẠI ĐÂY ]</w:t>
+              <w:br/>
+              <w:t>03_stored_persistence.png</w:t>
+            </w:r>
+          </w:p>
+        </w:tc>
+      </w:tr>
+    </w:tbl>
+    <w:p>
+      <w:pPr>
+        <w:spacing w:before="40" w:after="40"/>
+      </w:pPr>
+      <w:r>
+        <w:rPr>
+          <w:rFonts w:ascii="Times New Roman" w:hAnsi="Times New Roman"/>
+          <w:b/>
+          <w:sz w:val="24"/>
+        </w:rPr>
+        <w:t xml:space="preserve">Ảnh phải thể hiện: </w:t>
+      </w:r>
+      <w:r>
+        <w:rPr>
+          <w:rFonts w:ascii="Times New Roman" w:hAnsi="Times New Roman"/>
+          <w:b w:val="0"/>
+          <w:sz w:val="24"/>
+        </w:rPr>
+        <w:t>Ảnh sau khi đăng comment độc hại rồi reload. Phải thấy comment vẫn tồn tại và browser tiếp tục tạo/thi hành nội dung ở bản vulnerable. Nếu giao diện cho phép, mở Network/Response hoặc Database Inspector trong cùng ảnh.</w:t>
+      </w:r>
+    </w:p>
+    <w:p>
+      <w:pPr>
+        <w:spacing w:after="100"/>
+      </w:pPr>
+      <w:r>
+        <w:rPr>
+          <w:rFonts w:ascii="Times New Roman" w:hAnsi="Times New Roman"/>
+          <w:b/>
+          <w:sz w:val="24"/>
+        </w:rPr>
+        <w:t>Tên file đề nghị: 03_stored_persistence.png</w:t>
+      </w:r>
+    </w:p>
+    <w:p>
+      <w:pPr>
+        <w:spacing w:before="120" w:after="60"/>
+      </w:pPr>
+      <w:r>
+        <w:rPr>
+          <w:rFonts w:ascii="Times New Roman" w:hAnsi="Times New Roman"/>
+          <w:b/>
+          <w:sz w:val="24"/>
+        </w:rPr>
+        <w:t>Hình 4. Stored XSS - bản secure</w:t>
+      </w:r>
+    </w:p>
+    <w:tbl>
+      <w:tblPr>
+        <w:tblW w:type="auto" w:w="0"/>
+        <w:tblLayout w:type="fixed"/>
+        <w:tblLook w:firstColumn="1" w:firstRow="1" w:lastColumn="0" w:lastRow="0" w:noHBand="0" w:noVBand="1" w:val="04A0"/>
+      </w:tblPr>
+      <w:tblGrid>
+        <w:gridCol w:w="9072"/>
+      </w:tblGrid>
+      <w:tr>
+        <w:tc>
+          <w:tcPr>
+            <w:tcW w:type="dxa" w:w="9072"/>
+            <w:vAlign w:val="center"/>
+            <w:tcBorders>
+              <w:top w:val="dashed" w:sz="8" w:color="808080"/>
+              <w:left w:val="dashed" w:sz="8" w:color="808080"/>
+              <w:bottom w:val="dashed" w:sz="8" w:color="808080"/>
+              <w:right w:val="dashed" w:sz="8" w:color="808080"/>
+            </w:tcBorders>
+            <w:shd w:fill="F2F2F2"/>
+          </w:tcPr>
+          <w:p>
+            <w:pPr>
+              <w:spacing w:before="680" w:after="680"/>
+              <w:jc w:val="center"/>
+            </w:pPr>
+            <w:r>
+              <w:rPr>
+                <w:rFonts w:ascii="Times New Roman" w:hAnsi="Times New Roman"/>
+                <w:b/>
+                <w:sz w:val="28"/>
+              </w:rPr>
+              <w:t>[ CHÈN ẢNH 04 TẠI ĐÂY ]</w:t>
+              <w:br/>
+              <w:t>04_stored_secure.png</w:t>
+            </w:r>
+          </w:p>
+        </w:tc>
+      </w:tr>
+    </w:tbl>
+    <w:p>
+      <w:pPr>
+        <w:spacing w:before="40" w:after="40"/>
+      </w:pPr>
+      <w:r>
+        <w:rPr>
+          <w:rFonts w:ascii="Times New Roman" w:hAnsi="Times New Roman"/>
+          <w:b/>
+          <w:sz w:val="24"/>
+        </w:rPr>
+        <w:t xml:space="preserve">Ảnh phải thể hiện: </w:t>
+      </w:r>
+      <w:r>
+        <w:rPr>
+          <w:rFonts w:ascii="Times New Roman" w:hAnsi="Times New Roman"/>
+          <w:b w:val="0"/>
+          <w:sz w:val="24"/>
+        </w:rPr>
+        <w:t>Gửi cùng nội dung ở /secure/post/1/comments. Ảnh phải thấy event handler/thẻ nguy hiểm bị loại hoặc encode và không có alert.</w:t>
+      </w:r>
+    </w:p>
+    <w:p>
+      <w:pPr>
+        <w:spacing w:after="100"/>
+      </w:pPr>
+      <w:r>
+        <w:rPr>
+          <w:rFonts w:ascii="Times New Roman" w:hAnsi="Times New Roman"/>
+          <w:b/>
+          <w:sz w:val="24"/>
+        </w:rPr>
+        <w:t>Tên file đề nghị: 04_stored_secure.png</w:t>
+      </w:r>
+    </w:p>
+    <w:p>
+      <w:pPr>
+        <w:spacing w:before="120" w:after="60"/>
+      </w:pPr>
+      <w:r>
+        <w:rPr>
+          <w:rFonts w:ascii="Times New Roman" w:hAnsi="Times New Roman"/>
+          <w:b/>
+          <w:sz w:val="24"/>
+        </w:rPr>
+        <w:t>Hình 5. DOM-based XSS - so sánh vulnerable và secure</w:t>
+      </w:r>
+    </w:p>
+    <w:tbl>
+      <w:tblPr>
+        <w:tblW w:type="auto" w:w="0"/>
+        <w:tblLayout w:type="fixed"/>
+        <w:tblLook w:firstColumn="1" w:firstRow="1" w:lastColumn="0" w:lastRow="0" w:noHBand="0" w:noVBand="1" w:val="04A0"/>
+      </w:tblPr>
+      <w:tblGrid>
+        <w:gridCol w:w="9072"/>
+      </w:tblGrid>
+      <w:tr>
+        <w:tc>
+          <w:tcPr>
+            <w:tcW w:type="dxa" w:w="9072"/>
+            <w:vAlign w:val="center"/>
+            <w:tcBorders>
+              <w:top w:val="dashed" w:sz="8" w:color="808080"/>
+              <w:left w:val="dashed" w:sz="8" w:color="808080"/>
+              <w:bottom w:val="dashed" w:sz="8" w:color="808080"/>
+              <w:right w:val="dashed" w:sz="8" w:color="808080"/>
+            </w:tcBorders>
+            <w:shd w:fill="F2F2F2"/>
+          </w:tcPr>
+          <w:p>
+            <w:pPr>
+              <w:spacing w:before="680" w:after="680"/>
+              <w:jc w:val="center"/>
+            </w:pPr>
+            <w:r>
+              <w:rPr>
+                <w:rFonts w:ascii="Times New Roman" w:hAnsi="Times New Roman"/>
+                <w:b/>
+                <w:sz w:val="28"/>
+              </w:rPr>
+              <w:t>[ CHÈN ẢNH 05 TẠI ĐÂY ]</w:t>
+              <w:br/>
+              <w:t>05_dom_vulnerable_secure.png</w:t>
+            </w:r>
+          </w:p>
+        </w:tc>
+      </w:tr>
+    </w:tbl>
+    <w:p>
+      <w:pPr>
+        <w:spacing w:before="40" w:after="40"/>
+      </w:pPr>
+      <w:r>
+        <w:rPr>
+          <w:rFonts w:ascii="Times New Roman" w:hAnsi="Times New Roman"/>
+          <w:b/>
+          <w:sz w:val="24"/>
+        </w:rPr>
+        <w:t xml:space="preserve">Ảnh phải thể hiện: </w:t>
+      </w:r>
+      <w:r>
+        <w:rPr>
+          <w:rFonts w:ascii="Times New Roman" w:hAnsi="Times New Roman"/>
+          <w:b w:val="0"/>
+          <w:sz w:val="24"/>
+        </w:rPr>
+        <w:t>Xếp vulnerable và secure cạnh nhau trong một screenshot. Bên vulnerable dùng fragment và sinh DOM qua innerHTML. Bên secure hiển thị cùng fragment như textContent. Network không có request mới khi chỉ thay hash.</w:t>
+      </w:r>
+    </w:p>
+    <w:p>
+      <w:pPr>
+        <w:spacing w:after="100"/>
+      </w:pPr>
+      <w:r>
+        <w:rPr>
+          <w:rFonts w:ascii="Times New Roman" w:hAnsi="Times New Roman"/>
+          <w:b/>
+          <w:sz w:val="24"/>
+        </w:rPr>
+        <w:t>Tên file đề nghị: 05_dom_vulnerable_secure.png</w:t>
+      </w:r>
+    </w:p>
+    <w:p>
+      <w:pPr>
+        <w:spacing w:before="160" w:after="80"/>
+      </w:pPr>
+      <w:r>
+        <w:rPr>
+          <w:rFonts w:ascii="Times New Roman" w:hAnsi="Times New Roman"/>
+          <w:b/>
+          <w:color w:val="2F5597"/>
+          <w:sz w:val="26"/>
+        </w:rPr>
+        <w:t>Checklist ảnh trước khi nộp</w:t>
+      </w:r>
+    </w:p>
+    <w:p>
+      <w:pPr>
+        <w:spacing w:before="0" w:after="20"/>
+      </w:pPr>
+      <w:r>
+        <w:rPr>
+          <w:rFonts w:ascii="Times New Roman" w:hAnsi="Times New Roman"/>
+          <w:b w:val="0"/>
+          <w:sz w:val="24"/>
+        </w:rPr>
+        <w:t>• Đủ 5 ảnh theo danh sách, không có ảnh trùng ý.</w:t>
+      </w:r>
+    </w:p>
+    <w:p>
+      <w:pPr>
+        <w:spacing w:before="0" w:after="20"/>
+      </w:pPr>
+      <w:r>
+        <w:rPr>
+          <w:rFonts w:ascii="Times New Roman" w:hAnsi="Times New Roman"/>
+          <w:b w:val="0"/>
+          <w:sz w:val="24"/>
+        </w:rPr>
+        <w:t>• Ảnh đọc được URL/route và kết quả chính ở mức zoom bình thường.</w:t>
+      </w:r>
+    </w:p>
+    <w:p>
+      <w:pPr>
+        <w:spacing w:before="0" w:after="20"/>
+      </w:pPr>
+      <w:r>
+        <w:rPr>
+          <w:rFonts w:ascii="Times New Roman" w:hAnsi="Times New Roman"/>
+          <w:b w:val="0"/>
+          <w:sz w:val="24"/>
+        </w:rPr>
+        <w:t>• Bản vulnerable và secure dùng cùng input/scenario khi cần so sánh.</w:t>
+      </w:r>
+    </w:p>
+    <w:p>
+      <w:pPr>
+        <w:spacing w:before="0" w:after="20"/>
+      </w:pPr>
+      <w:r>
+        <w:rPr>
+          <w:rFonts w:ascii="Times New Roman" w:hAnsi="Times New Roman"/>
+          <w:b w:val="0"/>
+          <w:sz w:val="24"/>
+        </w:rPr>
+        <w:t>• Không lộ password, session ID, cookie đầy đủ, token đầy đủ hoặc secret key.</w:t>
+      </w:r>
+    </w:p>
+    <w:p>
+      <w:pPr>
+        <w:spacing w:before="0" w:after="20"/>
+      </w:pPr>
+      <w:r>
+        <w:rPr>
+          <w:rFonts w:ascii="Times New Roman" w:hAnsi="Times New Roman"/>
+          <w:b w:val="0"/>
+          <w:sz w:val="24"/>
+        </w:rPr>
+        <w:t>• Caption mô tả đúng điều ảnh chứng minh.</w:t>
+      </w:r>
+    </w:p>
     <w:sectPr>
       <w:headerReference w:type="default" r:id="rId9"/>
       <w:footerReference w:type="default" r:id="rId10"/>

</xml_diff>

<commit_message>
Rút gọn ảnh minh chứng và thêm placeholder cho 6 lab Topic04
Cập nhật 6 báo cáo DOCX và 6 HUONG_DAN_CHUP_ANH.md theo bộ 22 ảnh minh chứng tối thiểu.
</commit_message>
<xml_diff>
--- a/Lab01/report/21127645_LeMinh_21127224_NguyenVuBach_Lab01_XSS.docx
+++ b/Lab01/report/21127645_LeMinh_21127224_NguyenVuBach_Lab01_XSS.docx
@@ -5325,6 +5325,583 @@
       </w:tr>
     </w:tbl>
     <w:p/>
+    <w:p>
+      <w:r>
+        <w:br w:type="page"/>
+      </w:r>
+    </w:p>
+    <w:p>
+      <w:pPr>
+        <w:spacing w:before="160" w:after="80"/>
+      </w:pPr>
+      <w:r>
+        <w:rPr>
+          <w:rFonts w:ascii="Times New Roman" w:hAnsi="Times New Roman"/>
+          <w:b/>
+          <w:color w:val="2F5597"/>
+          <w:sz w:val="30"/>
+        </w:rPr>
+        <w:t>PHỤ LỤC BẰNG CHỨNG HÌNH ẢNH TỐI GIẢN</w:t>
+      </w:r>
+    </w:p>
+    <w:p>
+      <w:pPr>
+        <w:spacing w:before="0" w:after="100"/>
+      </w:pPr>
+      <w:r>
+        <w:rPr>
+          <w:rFonts w:ascii="Times New Roman" w:hAnsi="Times New Roman"/>
+          <w:b w:val="0"/>
+          <w:sz w:val="24"/>
+        </w:rPr>
+        <w:t>Phần này là bộ ảnh minh chứng tối thiểu cho Lab01 - CROSS-SITE SCRIPTING (XSS). Danh sách dưới đây thay cho việc chụp riêng từng tab DevTools hoặc nhiều ảnh lặp cùng một kết quả.</w:t>
+      </w:r>
+    </w:p>
+    <w:p>
+      <w:pPr>
+        <w:spacing w:before="0" w:after="80"/>
+      </w:pPr>
+      <w:r>
+        <w:rPr>
+          <w:rFonts w:ascii="Times New Roman" w:hAnsi="Times New Roman"/>
+          <w:b/>
+          <w:sz w:val="24"/>
+        </w:rPr>
+        <w:t>Tổng số ảnh cần chèn: 5.</w:t>
+      </w:r>
+    </w:p>
+    <w:p>
+      <w:pPr>
+        <w:spacing w:before="0" w:after="120"/>
+      </w:pPr>
+      <w:r>
+        <w:rPr>
+          <w:rFonts w:ascii="Times New Roman" w:hAnsi="Times New Roman"/>
+          <w:b w:val="0"/>
+          <w:sz w:val="24"/>
+        </w:rPr>
+        <w:t>Quy tắc: dùng đúng localhost và scenario có sẵn trong repository, giữ URL/route và kết quả chính, che password, session ID, cookie/token/secret dài. Không cần ảnh cài đặt, terminal khởi động, trang chủ hoặc ảnh trung gian.</w:t>
+      </w:r>
+    </w:p>
+    <w:p>
+      <w:pPr>
+        <w:spacing w:before="120" w:after="60"/>
+      </w:pPr>
+      <w:r>
+        <w:rPr>
+          <w:rFonts w:ascii="Times New Roman" w:hAnsi="Times New Roman"/>
+          <w:b/>
+          <w:sz w:val="24"/>
+        </w:rPr>
+        <w:t>Hình 1. Reflected XSS - bản vulnerable</w:t>
+      </w:r>
+    </w:p>
+    <w:tbl>
+      <w:tblPr>
+        <w:tblW w:type="auto" w:w="0"/>
+        <w:tblLayout w:type="fixed"/>
+        <w:tblLook w:firstColumn="1" w:firstRow="1" w:lastColumn="0" w:lastRow="0" w:noHBand="0" w:noVBand="1" w:val="04A0"/>
+      </w:tblPr>
+      <w:tblGrid>
+        <w:gridCol w:w="9072"/>
+      </w:tblGrid>
+      <w:tr>
+        <w:tc>
+          <w:tcPr>
+            <w:tcW w:type="dxa" w:w="9072"/>
+            <w:vAlign w:val="center"/>
+            <w:tcBorders>
+              <w:top w:val="dashed" w:sz="8" w:color="808080"/>
+              <w:left w:val="dashed" w:sz="8" w:color="808080"/>
+              <w:bottom w:val="dashed" w:sz="8" w:color="808080"/>
+              <w:right w:val="dashed" w:sz="8" w:color="808080"/>
+            </w:tcBorders>
+            <w:shd w:fill="F2F2F2"/>
+          </w:tcPr>
+          <w:p>
+            <w:pPr>
+              <w:spacing w:before="680" w:after="680"/>
+              <w:jc w:val="center"/>
+            </w:pPr>
+            <w:r>
+              <w:rPr>
+                <w:rFonts w:ascii="Times New Roman" w:hAnsi="Times New Roman"/>
+                <w:b/>
+                <w:sz w:val="28"/>
+              </w:rPr>
+              <w:t>[ CHÈN ẢNH 01 TẠI ĐÂY ]</w:t>
+              <w:br/>
+              <w:t>01_reflected_vulnerable.png</w:t>
+            </w:r>
+          </w:p>
+        </w:tc>
+      </w:tr>
+    </w:tbl>
+    <w:p>
+      <w:pPr>
+        <w:spacing w:before="40" w:after="40"/>
+      </w:pPr>
+      <w:r>
+        <w:rPr>
+          <w:rFonts w:ascii="Times New Roman" w:hAnsi="Times New Roman"/>
+          <w:b/>
+          <w:sz w:val="24"/>
+        </w:rPr>
+        <w:t xml:space="preserve">Ảnh phải thể hiện: </w:t>
+      </w:r>
+      <w:r>
+        <w:rPr>
+          <w:rFonts w:ascii="Times New Roman" w:hAnsi="Times New Roman"/>
+          <w:b w:val="0"/>
+          <w:sz w:val="24"/>
+        </w:rPr>
+        <w:t>Hiển thị URL /vulnerable/search, payload đã nhập, alert hoặc DOM img/onerror và Network request q. Một ảnh phải chứng minh input bị phản chiếu thành HTML thực thi.</w:t>
+      </w:r>
+    </w:p>
+    <w:p>
+      <w:pPr>
+        <w:spacing w:after="100"/>
+      </w:pPr>
+      <w:r>
+        <w:rPr>
+          <w:rFonts w:ascii="Times New Roman" w:hAnsi="Times New Roman"/>
+          <w:b/>
+          <w:sz w:val="24"/>
+        </w:rPr>
+        <w:t>Tên file đề nghị: 01_reflected_vulnerable.png</w:t>
+      </w:r>
+    </w:p>
+    <w:p>
+      <w:pPr>
+        <w:spacing w:before="120" w:after="60"/>
+      </w:pPr>
+      <w:r>
+        <w:rPr>
+          <w:rFonts w:ascii="Times New Roman" w:hAnsi="Times New Roman"/>
+          <w:b/>
+          <w:sz w:val="24"/>
+        </w:rPr>
+        <w:t>Hình 2. Reflected XSS - bản secure</w:t>
+      </w:r>
+    </w:p>
+    <w:tbl>
+      <w:tblPr>
+        <w:tblW w:type="auto" w:w="0"/>
+        <w:tblLayout w:type="fixed"/>
+        <w:tblLook w:firstColumn="1" w:firstRow="1" w:lastColumn="0" w:lastRow="0" w:noHBand="0" w:noVBand="1" w:val="04A0"/>
+      </w:tblPr>
+      <w:tblGrid>
+        <w:gridCol w:w="9072"/>
+      </w:tblGrid>
+      <w:tr>
+        <w:tc>
+          <w:tcPr>
+            <w:tcW w:type="dxa" w:w="9072"/>
+            <w:vAlign w:val="center"/>
+            <w:tcBorders>
+              <w:top w:val="dashed" w:sz="8" w:color="808080"/>
+              <w:left w:val="dashed" w:sz="8" w:color="808080"/>
+              <w:bottom w:val="dashed" w:sz="8" w:color="808080"/>
+              <w:right w:val="dashed" w:sz="8" w:color="808080"/>
+            </w:tcBorders>
+            <w:shd w:fill="F2F2F2"/>
+          </w:tcPr>
+          <w:p>
+            <w:pPr>
+              <w:spacing w:before="680" w:after="680"/>
+              <w:jc w:val="center"/>
+            </w:pPr>
+            <w:r>
+              <w:rPr>
+                <w:rFonts w:ascii="Times New Roman" w:hAnsi="Times New Roman"/>
+                <w:b/>
+                <w:sz w:val="28"/>
+              </w:rPr>
+              <w:t>[ CHÈN ẢNH 02 TẠI ĐÂY ]</w:t>
+              <w:br/>
+              <w:t>02_reflected_secure.png</w:t>
+            </w:r>
+          </w:p>
+        </w:tc>
+      </w:tr>
+    </w:tbl>
+    <w:p>
+      <w:pPr>
+        <w:spacing w:before="40" w:after="40"/>
+      </w:pPr>
+      <w:r>
+        <w:rPr>
+          <w:rFonts w:ascii="Times New Roman" w:hAnsi="Times New Roman"/>
+          <w:b/>
+          <w:sz w:val="24"/>
+        </w:rPr>
+        <w:t xml:space="preserve">Ảnh phải thể hiện: </w:t>
+      </w:r>
+      <w:r>
+        <w:rPr>
+          <w:rFonts w:ascii="Times New Roman" w:hAnsi="Times New Roman"/>
+          <w:b w:val="0"/>
+          <w:sz w:val="24"/>
+        </w:rPr>
+        <w:t>Gửi đúng payload ở /secure/search. Ảnh phải thấy payload chỉ hiển thị như text/đã encode và không có alert.</w:t>
+      </w:r>
+    </w:p>
+    <w:p>
+      <w:pPr>
+        <w:spacing w:after="100"/>
+      </w:pPr>
+      <w:r>
+        <w:rPr>
+          <w:rFonts w:ascii="Times New Roman" w:hAnsi="Times New Roman"/>
+          <w:b/>
+          <w:sz w:val="24"/>
+        </w:rPr>
+        <w:t>Tên file đề nghị: 02_reflected_secure.png</w:t>
+      </w:r>
+    </w:p>
+    <w:p>
+      <w:pPr>
+        <w:spacing w:before="120" w:after="60"/>
+      </w:pPr>
+      <w:r>
+        <w:rPr>
+          <w:rFonts w:ascii="Times New Roman" w:hAnsi="Times New Roman"/>
+          <w:b/>
+          <w:sz w:val="24"/>
+        </w:rPr>
+        <w:t>Hình 3. Stored XSS - lưu và tồn tại sau reload</w:t>
+      </w:r>
+    </w:p>
+    <w:tbl>
+      <w:tblPr>
+        <w:tblW w:type="auto" w:w="0"/>
+        <w:tblLayout w:type="fixed"/>
+        <w:tblLook w:firstColumn="1" w:firstRow="1" w:lastColumn="0" w:lastRow="0" w:noHBand="0" w:noVBand="1" w:val="04A0"/>
+      </w:tblPr>
+      <w:tblGrid>
+        <w:gridCol w:w="9072"/>
+      </w:tblGrid>
+      <w:tr>
+        <w:tc>
+          <w:tcPr>
+            <w:tcW w:type="dxa" w:w="9072"/>
+            <w:vAlign w:val="center"/>
+            <w:tcBorders>
+              <w:top w:val="dashed" w:sz="8" w:color="808080"/>
+              <w:left w:val="dashed" w:sz="8" w:color="808080"/>
+              <w:bottom w:val="dashed" w:sz="8" w:color="808080"/>
+              <w:right w:val="dashed" w:sz="8" w:color="808080"/>
+            </w:tcBorders>
+            <w:shd w:fill="F2F2F2"/>
+          </w:tcPr>
+          <w:p>
+            <w:pPr>
+              <w:spacing w:before="680" w:after="680"/>
+              <w:jc w:val="center"/>
+            </w:pPr>
+            <w:r>
+              <w:rPr>
+                <w:rFonts w:ascii="Times New Roman" w:hAnsi="Times New Roman"/>
+                <w:b/>
+                <w:sz w:val="28"/>
+              </w:rPr>
+              <w:t>[ CHÈN ẢNH 03 TẠI ĐÂY ]</w:t>
+              <w:br/>
+              <w:t>03_stored_persistence.png</w:t>
+            </w:r>
+          </w:p>
+        </w:tc>
+      </w:tr>
+    </w:tbl>
+    <w:p>
+      <w:pPr>
+        <w:spacing w:before="40" w:after="40"/>
+      </w:pPr>
+      <w:r>
+        <w:rPr>
+          <w:rFonts w:ascii="Times New Roman" w:hAnsi="Times New Roman"/>
+          <w:b/>
+          <w:sz w:val="24"/>
+        </w:rPr>
+        <w:t xml:space="preserve">Ảnh phải thể hiện: </w:t>
+      </w:r>
+      <w:r>
+        <w:rPr>
+          <w:rFonts w:ascii="Times New Roman" w:hAnsi="Times New Roman"/>
+          <w:b w:val="0"/>
+          <w:sz w:val="24"/>
+        </w:rPr>
+        <w:t>Ảnh sau khi đăng comment độc hại rồi reload. Phải thấy comment vẫn tồn tại và browser tiếp tục tạo/thi hành nội dung ở bản vulnerable. Nếu giao diện cho phép, mở Network/Response hoặc Database Inspector trong cùng ảnh.</w:t>
+      </w:r>
+    </w:p>
+    <w:p>
+      <w:pPr>
+        <w:spacing w:after="100"/>
+      </w:pPr>
+      <w:r>
+        <w:rPr>
+          <w:rFonts w:ascii="Times New Roman" w:hAnsi="Times New Roman"/>
+          <w:b/>
+          <w:sz w:val="24"/>
+        </w:rPr>
+        <w:t>Tên file đề nghị: 03_stored_persistence.png</w:t>
+      </w:r>
+    </w:p>
+    <w:p>
+      <w:pPr>
+        <w:spacing w:before="120" w:after="60"/>
+      </w:pPr>
+      <w:r>
+        <w:rPr>
+          <w:rFonts w:ascii="Times New Roman" w:hAnsi="Times New Roman"/>
+          <w:b/>
+          <w:sz w:val="24"/>
+        </w:rPr>
+        <w:t>Hình 4. Stored XSS - bản secure</w:t>
+      </w:r>
+    </w:p>
+    <w:tbl>
+      <w:tblPr>
+        <w:tblW w:type="auto" w:w="0"/>
+        <w:tblLayout w:type="fixed"/>
+        <w:tblLook w:firstColumn="1" w:firstRow="1" w:lastColumn="0" w:lastRow="0" w:noHBand="0" w:noVBand="1" w:val="04A0"/>
+      </w:tblPr>
+      <w:tblGrid>
+        <w:gridCol w:w="9072"/>
+      </w:tblGrid>
+      <w:tr>
+        <w:tc>
+          <w:tcPr>
+            <w:tcW w:type="dxa" w:w="9072"/>
+            <w:vAlign w:val="center"/>
+            <w:tcBorders>
+              <w:top w:val="dashed" w:sz="8" w:color="808080"/>
+              <w:left w:val="dashed" w:sz="8" w:color="808080"/>
+              <w:bottom w:val="dashed" w:sz="8" w:color="808080"/>
+              <w:right w:val="dashed" w:sz="8" w:color="808080"/>
+            </w:tcBorders>
+            <w:shd w:fill="F2F2F2"/>
+          </w:tcPr>
+          <w:p>
+            <w:pPr>
+              <w:spacing w:before="680" w:after="680"/>
+              <w:jc w:val="center"/>
+            </w:pPr>
+            <w:r>
+              <w:rPr>
+                <w:rFonts w:ascii="Times New Roman" w:hAnsi="Times New Roman"/>
+                <w:b/>
+                <w:sz w:val="28"/>
+              </w:rPr>
+              <w:t>[ CHÈN ẢNH 04 TẠI ĐÂY ]</w:t>
+              <w:br/>
+              <w:t>04_stored_secure.png</w:t>
+            </w:r>
+          </w:p>
+        </w:tc>
+      </w:tr>
+    </w:tbl>
+    <w:p>
+      <w:pPr>
+        <w:spacing w:before="40" w:after="40"/>
+      </w:pPr>
+      <w:r>
+        <w:rPr>
+          <w:rFonts w:ascii="Times New Roman" w:hAnsi="Times New Roman"/>
+          <w:b/>
+          <w:sz w:val="24"/>
+        </w:rPr>
+        <w:t xml:space="preserve">Ảnh phải thể hiện: </w:t>
+      </w:r>
+      <w:r>
+        <w:rPr>
+          <w:rFonts w:ascii="Times New Roman" w:hAnsi="Times New Roman"/>
+          <w:b w:val="0"/>
+          <w:sz w:val="24"/>
+        </w:rPr>
+        <w:t>Gửi cùng nội dung ở /secure/post/1/comments. Ảnh phải thấy event handler/thẻ nguy hiểm bị loại hoặc encode và không có alert.</w:t>
+      </w:r>
+    </w:p>
+    <w:p>
+      <w:pPr>
+        <w:spacing w:after="100"/>
+      </w:pPr>
+      <w:r>
+        <w:rPr>
+          <w:rFonts w:ascii="Times New Roman" w:hAnsi="Times New Roman"/>
+          <w:b/>
+          <w:sz w:val="24"/>
+        </w:rPr>
+        <w:t>Tên file đề nghị: 04_stored_secure.png</w:t>
+      </w:r>
+    </w:p>
+    <w:p>
+      <w:pPr>
+        <w:spacing w:before="120" w:after="60"/>
+      </w:pPr>
+      <w:r>
+        <w:rPr>
+          <w:rFonts w:ascii="Times New Roman" w:hAnsi="Times New Roman"/>
+          <w:b/>
+          <w:sz w:val="24"/>
+        </w:rPr>
+        <w:t>Hình 5. DOM-based XSS - so sánh vulnerable và secure</w:t>
+      </w:r>
+    </w:p>
+    <w:tbl>
+      <w:tblPr>
+        <w:tblW w:type="auto" w:w="0"/>
+        <w:tblLayout w:type="fixed"/>
+        <w:tblLook w:firstColumn="1" w:firstRow="1" w:lastColumn="0" w:lastRow="0" w:noHBand="0" w:noVBand="1" w:val="04A0"/>
+      </w:tblPr>
+      <w:tblGrid>
+        <w:gridCol w:w="9072"/>
+      </w:tblGrid>
+      <w:tr>
+        <w:tc>
+          <w:tcPr>
+            <w:tcW w:type="dxa" w:w="9072"/>
+            <w:vAlign w:val="center"/>
+            <w:tcBorders>
+              <w:top w:val="dashed" w:sz="8" w:color="808080"/>
+              <w:left w:val="dashed" w:sz="8" w:color="808080"/>
+              <w:bottom w:val="dashed" w:sz="8" w:color="808080"/>
+              <w:right w:val="dashed" w:sz="8" w:color="808080"/>
+            </w:tcBorders>
+            <w:shd w:fill="F2F2F2"/>
+          </w:tcPr>
+          <w:p>
+            <w:pPr>
+              <w:spacing w:before="680" w:after="680"/>
+              <w:jc w:val="center"/>
+            </w:pPr>
+            <w:r>
+              <w:rPr>
+                <w:rFonts w:ascii="Times New Roman" w:hAnsi="Times New Roman"/>
+                <w:b/>
+                <w:sz w:val="28"/>
+              </w:rPr>
+              <w:t>[ CHÈN ẢNH 05 TẠI ĐÂY ]</w:t>
+              <w:br/>
+              <w:t>05_dom_vulnerable_secure.png</w:t>
+            </w:r>
+          </w:p>
+        </w:tc>
+      </w:tr>
+    </w:tbl>
+    <w:p>
+      <w:pPr>
+        <w:spacing w:before="40" w:after="40"/>
+      </w:pPr>
+      <w:r>
+        <w:rPr>
+          <w:rFonts w:ascii="Times New Roman" w:hAnsi="Times New Roman"/>
+          <w:b/>
+          <w:sz w:val="24"/>
+        </w:rPr>
+        <w:t xml:space="preserve">Ảnh phải thể hiện: </w:t>
+      </w:r>
+      <w:r>
+        <w:rPr>
+          <w:rFonts w:ascii="Times New Roman" w:hAnsi="Times New Roman"/>
+          <w:b w:val="0"/>
+          <w:sz w:val="24"/>
+        </w:rPr>
+        <w:t>Xếp vulnerable và secure cạnh nhau trong một screenshot. Bên vulnerable dùng fragment và sinh DOM qua innerHTML. Bên secure hiển thị cùng fragment như textContent. Network không có request mới khi chỉ thay hash.</w:t>
+      </w:r>
+    </w:p>
+    <w:p>
+      <w:pPr>
+        <w:spacing w:after="100"/>
+      </w:pPr>
+      <w:r>
+        <w:rPr>
+          <w:rFonts w:ascii="Times New Roman" w:hAnsi="Times New Roman"/>
+          <w:b/>
+          <w:sz w:val="24"/>
+        </w:rPr>
+        <w:t>Tên file đề nghị: 05_dom_vulnerable_secure.png</w:t>
+      </w:r>
+    </w:p>
+    <w:p>
+      <w:pPr>
+        <w:spacing w:before="160" w:after="80"/>
+      </w:pPr>
+      <w:r>
+        <w:rPr>
+          <w:rFonts w:ascii="Times New Roman" w:hAnsi="Times New Roman"/>
+          <w:b/>
+          <w:color w:val="2F5597"/>
+          <w:sz w:val="26"/>
+        </w:rPr>
+        <w:t>Checklist ảnh trước khi nộp</w:t>
+      </w:r>
+    </w:p>
+    <w:p>
+      <w:pPr>
+        <w:spacing w:before="0" w:after="20"/>
+      </w:pPr>
+      <w:r>
+        <w:rPr>
+          <w:rFonts w:ascii="Times New Roman" w:hAnsi="Times New Roman"/>
+          <w:b w:val="0"/>
+          <w:sz w:val="24"/>
+        </w:rPr>
+        <w:t>• Đủ 5 ảnh theo danh sách, không có ảnh trùng ý.</w:t>
+      </w:r>
+    </w:p>
+    <w:p>
+      <w:pPr>
+        <w:spacing w:before="0" w:after="20"/>
+      </w:pPr>
+      <w:r>
+        <w:rPr>
+          <w:rFonts w:ascii="Times New Roman" w:hAnsi="Times New Roman"/>
+          <w:b w:val="0"/>
+          <w:sz w:val="24"/>
+        </w:rPr>
+        <w:t>• Ảnh đọc được URL/route và kết quả chính ở mức zoom bình thường.</w:t>
+      </w:r>
+    </w:p>
+    <w:p>
+      <w:pPr>
+        <w:spacing w:before="0" w:after="20"/>
+      </w:pPr>
+      <w:r>
+        <w:rPr>
+          <w:rFonts w:ascii="Times New Roman" w:hAnsi="Times New Roman"/>
+          <w:b w:val="0"/>
+          <w:sz w:val="24"/>
+        </w:rPr>
+        <w:t>• Bản vulnerable và secure dùng cùng input/scenario khi cần so sánh.</w:t>
+      </w:r>
+    </w:p>
+    <w:p>
+      <w:pPr>
+        <w:spacing w:before="0" w:after="20"/>
+      </w:pPr>
+      <w:r>
+        <w:rPr>
+          <w:rFonts w:ascii="Times New Roman" w:hAnsi="Times New Roman"/>
+          <w:b w:val="0"/>
+          <w:sz w:val="24"/>
+        </w:rPr>
+        <w:t>• Không lộ password, session ID, cookie đầy đủ, token đầy đủ hoặc secret key.</w:t>
+      </w:r>
+    </w:p>
+    <w:p>
+      <w:pPr>
+        <w:spacing w:before="0" w:after="20"/>
+      </w:pPr>
+      <w:r>
+        <w:rPr>
+          <w:rFonts w:ascii="Times New Roman" w:hAnsi="Times New Roman"/>
+          <w:b w:val="0"/>
+          <w:sz w:val="24"/>
+        </w:rPr>
+        <w:t>• Caption mô tả đúng điều ảnh chứng minh.</w:t>
+      </w:r>
+    </w:p>
     <w:sectPr>
       <w:headerReference w:type="default" r:id="rId9"/>
       <w:footerReference w:type="default" r:id="rId10"/>

</xml_diff>